<commit_message>
docs(sipes): fecha as 24 fichas (18 do texto integral + 6 do resumo)
- boccolini_2011 obtido do SciELO-IEC -> ficha completa (18 PDFs agora).
- paim, castro, barreto, rasella, dixon, matheus: ficha PARCIAL redigida a
  partir do resumo publicado (PubMed / Semantic Scholar) — resumo autoral,
  conceito, relação com o Farol-SS e citação indireta prontos; a citação
  direta fica marcada "confirmar no texto integral" (tipo: parcial em
  fichas_analiticas.yml; 05 distingue completa/parcial).
- fichamento.ris/.md: 24/24 fichas.
- banner-v1: +BARRETO et al. (2007) e +RASELLA et al. (2013) na introdução
  (17 referências).
- RESULTADO.md atualizado.
</commit_message>
<xml_diff>
--- a/docs/sipes-2026/banner-v1-sipes-2026.docx
+++ b/docs/sipes-2026/banner-v1-sipes-2026.docx
@@ -376,6 +376,46 @@
                 <w:sz w:val="18"/>
               </w:rPr>
               <w:t>(BARCELLOS, 2005)</w:t>
+            </w:r>
+            <w:r>
+              <w:rPr>
+                <w:rFonts w:ascii="Calibri" w:hAnsi="Calibri"/>
+                <w:b w:val="0"/>
+                <w:i w:val="0"/>
+                <w:color w:val="12303F"/>
+                <w:sz w:val="18"/>
+              </w:rPr>
+              <w:t xml:space="preserve">. A relação inversa é robusta: um programa de saneamento de escala urbana em Salvador reduziu a diarreia infantil </w:t>
+            </w:r>
+            <w:r>
+              <w:rPr>
+                <w:rFonts w:ascii="Calibri" w:hAnsi="Calibri"/>
+                <w:b/>
+                <w:i w:val="0"/>
+                <w:color w:val="0D4585"/>
+                <w:sz w:val="18"/>
+              </w:rPr>
+              <w:t>(BARRETO et al., 2007)</w:t>
+            </w:r>
+            <w:r>
+              <w:rPr>
+                <w:rFonts w:ascii="Calibri" w:hAnsi="Calibri"/>
+                <w:b w:val="0"/>
+                <w:i w:val="0"/>
+                <w:color w:val="12303F"/>
+                <w:sz w:val="18"/>
+              </w:rPr>
+              <w:t xml:space="preserve">, e transferências de renda condicionadas reduziram a mortalidade de menores de cinco anos por causas ligadas à pobreza </w:t>
+            </w:r>
+            <w:r>
+              <w:rPr>
+                <w:rFonts w:ascii="Calibri" w:hAnsi="Calibri"/>
+                <w:b/>
+                <w:i w:val="0"/>
+                <w:color w:val="0D4585"/>
+                <w:sz w:val="18"/>
+              </w:rPr>
+              <w:t>(RASELLA et al., 2013)</w:t>
             </w:r>
             <w:r>
               <w:rPr>
@@ -1337,6 +1377,22 @@
                 <w:color w:val="12303F"/>
                 <w:sz w:val="13"/>
               </w:rPr>
+              <w:t>BARRETO, M. L. et al. Effect of city-wide sanitation programme on reduction in rate of childhood diarrhoea in northeast Brazil: assessment by two cohort studies. The Lancet, v. 370, n. 9599, p. 1622-1628, 2007. DOI: https://doi.org/10.1016/s0140-6736(07)61638-9. Acesso em: [DATA].</w:t>
+            </w:r>
+          </w:p>
+          <w:p>
+            <w:pPr>
+              <w:spacing w:after="20" w:before="0" w:line="240" w:lineRule="auto"/>
+              <w:ind w:left="0"/>
+            </w:pPr>
+            <w:r>
+              <w:rPr>
+                <w:rFonts w:ascii="Calibri" w:hAnsi="Calibri"/>
+                <w:b w:val="0"/>
+                <w:i w:val="0"/>
+                <w:color w:val="12303F"/>
+                <w:sz w:val="13"/>
+              </w:rPr>
               <w:t>CARVALHO, G. d. P. Desigualdades regionais e o papel dos recursos federais no SUS: fatores políticos condicionam a alocação de recursos?. Ciência &amp; Saúde Coletiva, v. 26, n. suppl 2, p. 3409-3421, 2021. DOI: https://doi.org/10.1590/1413-81232021269.2.31192019. Acesso em: [DATA].</w:t>
             </w:r>
           </w:p>
@@ -1482,6 +1538,22 @@
                 <w:sz w:val="13"/>
               </w:rPr>
               <w:t>PAIVA, R. F. d. P. d. S.; SOUZA, M. F. d. P. d. Associação entre condições socioeconômicas, sanitárias e de atenção básica e a morbidade hospitalar por doenças de veiculação hídrica no Brasil. Cadernos de Saúde Pública, v. 34, n. 1, 2018. DOI: https://doi.org/10.1590/0102-311x00017316. Acesso em: [DATA].</w:t>
+            </w:r>
+          </w:p>
+          <w:p>
+            <w:pPr>
+              <w:spacing w:after="20" w:before="0" w:line="240" w:lineRule="auto"/>
+              <w:ind w:left="0"/>
+            </w:pPr>
+            <w:r>
+              <w:rPr>
+                <w:rFonts w:ascii="Calibri" w:hAnsi="Calibri"/>
+                <w:b w:val="0"/>
+                <w:i w:val="0"/>
+                <w:color w:val="12303F"/>
+                <w:sz w:val="13"/>
+              </w:rPr>
+              <w:t>RASELLA, D. et al. Effect of a conditional cash transfer programme on childhood mortality: a nationwide analysis of Brazilian municipalities. The Lancet, v. 382, n. 9886, p. 57-64, 2013. DOI: https://doi.org/10.1016/s0140-6736(13)60715-1. Acesso em: [DATA].</w:t>
             </w:r>
           </w:p>
           <w:p>

</xml_diff>